<commit_message>
LSA first sequence: Economic Geography question limited to lessons 1-2; Geography of Cameroon in its own section
Question 6 now covers natural resources and the meaning, types and
importance of agriculture only; the Cameroon question moves to a new
Section G built on the first two lessons (relief and climate of Cameroon).

Co-Authored-By: Claude Opus 5.5 <noreply@anthropic.com>
Claude-Session: https://claude.ai/code/session_0115LFSb2ktGLWPeVksFkSer
</commit_message>
<xml_diff>
--- a/epreuves/2026-2027/Sequence_1/LSA_Geography_Seq1_2026-2027.docx
+++ b/epreuves/2026-2027/Sequence_1/LSA_Geography_Seq1_2026-2027.docx
@@ -1712,7 +1712,25 @@
           <w:sz w:val="24"/>
           <w:szCs w:val="24"/>
         </w:rPr>
-        <w:t xml:space="preserve">(a)	Distinguish between primary, secondary and tertiary economic activities, giving one example of each from Cameroon. </w:t>
+        <w:t xml:space="preserve">(a)	Distinguish between renewable and non-renewable natural resources, giving </w:t>
+      </w:r>
+      <w:r>
+        <w:rPr>
+          <w:rFonts w:ascii="Times New Roman" w:cs="Times New Roman" w:eastAsia="Times New Roman" w:hAnsi="Times New Roman"/>
+          <w:b/>
+          <w:bCs/>
+          <w:sz w:val="24"/>
+          <w:szCs w:val="24"/>
+        </w:rPr>
+        <w:t xml:space="preserve">two</w:t>
+      </w:r>
+      <w:r>
+        <w:rPr>
+          <w:rFonts w:ascii="Times New Roman" w:cs="Times New Roman" w:eastAsia="Times New Roman" w:hAnsi="Times New Roman"/>
+          <w:sz w:val="24"/>
+          <w:szCs w:val="24"/>
+        </w:rPr>
+        <w:t xml:space="preserve"> examples of each. </w:t>
       </w:r>
       <w:r>
         <w:rPr>
@@ -1740,17 +1758,17 @@
           <w:sz w:val="24"/>
           <w:szCs w:val="24"/>
         </w:rPr>
-        <w:t xml:space="preserve">(b)	Why are minerals and fossil fuels described as non-renewable resources? </w:t>
-      </w:r>
-      <w:r>
-        <w:rPr>
-          <w:rFonts w:ascii="Times New Roman" w:cs="Times New Roman" w:eastAsia="Times New Roman" w:hAnsi="Times New Roman"/>
-          <w:b/>
-          <w:bCs/>
-          <w:sz w:val="24"/>
-          <w:szCs w:val="24"/>
-        </w:rPr>
-        <w:t xml:space="preserve">(4 marks)</w:t>
+        <w:t xml:space="preserve">(b)	Distinguish between arable farming, pastoral farming and mixed farming. </w:t>
+      </w:r>
+      <w:r>
+        <w:rPr>
+          <w:rFonts w:ascii="Times New Roman" w:cs="Times New Roman" w:eastAsia="Times New Roman" w:hAnsi="Times New Roman"/>
+          <w:b/>
+          <w:bCs/>
+          <w:sz w:val="24"/>
+          <w:szCs w:val="24"/>
+        </w:rPr>
+        <w:t xml:space="preserve">(6 marks)</w:t>
       </w:r>
     </w:p>
     <w:p>
@@ -1768,17 +1786,187 @@
           <w:sz w:val="24"/>
           <w:szCs w:val="24"/>
         </w:rPr>
-        <w:t xml:space="preserve">(c)	Assess the contribution of agriculture to the economy of Cameroon. </w:t>
-      </w:r>
-      <w:r>
-        <w:rPr>
-          <w:rFonts w:ascii="Times New Roman" w:cs="Times New Roman" w:eastAsia="Times New Roman" w:hAnsi="Times New Roman"/>
-          <w:b/>
-          <w:bCs/>
-          <w:sz w:val="24"/>
-          <w:szCs w:val="24"/>
-        </w:rPr>
-        <w:t xml:space="preserve">(10 marks)</w:t>
+        <w:t xml:space="preserve">(c)	Explain </w:t>
+      </w:r>
+      <w:r>
+        <w:rPr>
+          <w:rFonts w:ascii="Times New Roman" w:cs="Times New Roman" w:eastAsia="Times New Roman" w:hAnsi="Times New Roman"/>
+          <w:b/>
+          <w:bCs/>
+          <w:sz w:val="24"/>
+          <w:szCs w:val="24"/>
+        </w:rPr>
+        <w:t xml:space="preserve">four</w:t>
+      </w:r>
+      <w:r>
+        <w:rPr>
+          <w:rFonts w:ascii="Times New Roman" w:cs="Times New Roman" w:eastAsia="Times New Roman" w:hAnsi="Times New Roman"/>
+          <w:sz w:val="24"/>
+          <w:szCs w:val="24"/>
+        </w:rPr>
+        <w:t xml:space="preserve"> ways in which agriculture is important to the economy of a country. </w:t>
+      </w:r>
+      <w:r>
+        <w:rPr>
+          <w:rFonts w:ascii="Times New Roman" w:cs="Times New Roman" w:eastAsia="Times New Roman" w:hAnsi="Times New Roman"/>
+          <w:b/>
+          <w:bCs/>
+          <w:sz w:val="24"/>
+          <w:szCs w:val="24"/>
+        </w:rPr>
+        <w:t xml:space="preserve">(8 marks)</w:t>
+      </w:r>
+    </w:p>
+    <w:p>
+      <w:pPr>
+        <w:keepNext/>
+        <w:spacing w:after="80" w:before="200"/>
+      </w:pPr>
+      <w:r>
+        <w:rPr>
+          <w:rFonts w:ascii="Times New Roman" w:cs="Times New Roman" w:eastAsia="Times New Roman" w:hAnsi="Times New Roman"/>
+          <w:b/>
+          <w:bCs/>
+          <w:sz w:val="24"/>
+          <w:szCs w:val="24"/>
+        </w:rPr>
+        <w:t xml:space="preserve">SECTION G: GEOGRAPHY OF CAMEROON</w:t>
+      </w:r>
+    </w:p>
+    <w:p>
+      <w:pPr>
+        <w:keepNext/>
+        <w:spacing w:after="60" w:before="0"/>
+      </w:pPr>
+      <w:r>
+        <w:rPr>
+          <w:rFonts w:ascii="Times New Roman" w:cs="Times New Roman" w:eastAsia="Times New Roman" w:hAnsi="Times New Roman"/>
+          <w:b/>
+          <w:bCs/>
+          <w:sz w:val="24"/>
+          <w:szCs w:val="24"/>
+        </w:rPr>
+        <w:t xml:space="preserve">Question 7</w:t>
+      </w:r>
+    </w:p>
+    <w:p>
+      <w:pPr>
+        <w:tabs>
+          <w:tab w:val="left" w:pos="1000"/>
+          <w:tab w:val="left" w:pos="1500"/>
+        </w:tabs>
+        <w:spacing w:after="70" w:line="300"/>
+        <w:ind w:left="1000" w:hanging="600"/>
+      </w:pPr>
+      <w:r>
+        <w:rPr>
+          <w:rFonts w:ascii="Times New Roman" w:cs="Times New Roman" w:eastAsia="Times New Roman" w:hAnsi="Times New Roman"/>
+          <w:sz w:val="24"/>
+          <w:szCs w:val="24"/>
+        </w:rPr>
+        <w:t xml:space="preserve">(a)	Name the </w:t>
+      </w:r>
+      <w:r>
+        <w:rPr>
+          <w:rFonts w:ascii="Times New Roman" w:cs="Times New Roman" w:eastAsia="Times New Roman" w:hAnsi="Times New Roman"/>
+          <w:b/>
+          <w:bCs/>
+          <w:sz w:val="24"/>
+          <w:szCs w:val="24"/>
+        </w:rPr>
+        <w:t xml:space="preserve">three</w:t>
+      </w:r>
+      <w:r>
+        <w:rPr>
+          <w:rFonts w:ascii="Times New Roman" w:cs="Times New Roman" w:eastAsia="Times New Roman" w:hAnsi="Times New Roman"/>
+          <w:sz w:val="24"/>
+          <w:szCs w:val="24"/>
+        </w:rPr>
+        <w:t xml:space="preserve"> major highlands and the </w:t>
+      </w:r>
+      <w:r>
+        <w:rPr>
+          <w:rFonts w:ascii="Times New Roman" w:cs="Times New Roman" w:eastAsia="Times New Roman" w:hAnsi="Times New Roman"/>
+          <w:b/>
+          <w:bCs/>
+          <w:sz w:val="24"/>
+          <w:szCs w:val="24"/>
+        </w:rPr>
+        <w:t xml:space="preserve">two</w:t>
+      </w:r>
+      <w:r>
+        <w:rPr>
+          <w:rFonts w:ascii="Times New Roman" w:cs="Times New Roman" w:eastAsia="Times New Roman" w:hAnsi="Times New Roman"/>
+          <w:sz w:val="24"/>
+          <w:szCs w:val="24"/>
+        </w:rPr>
+        <w:t xml:space="preserve"> major lowlands of Cameroon. </w:t>
+      </w:r>
+      <w:r>
+        <w:rPr>
+          <w:rFonts w:ascii="Times New Roman" w:cs="Times New Roman" w:eastAsia="Times New Roman" w:hAnsi="Times New Roman"/>
+          <w:b/>
+          <w:bCs/>
+          <w:sz w:val="24"/>
+          <w:szCs w:val="24"/>
+        </w:rPr>
+        <w:t xml:space="preserve">(5 marks)</w:t>
+      </w:r>
+    </w:p>
+    <w:p>
+      <w:pPr>
+        <w:tabs>
+          <w:tab w:val="left" w:pos="1000"/>
+          <w:tab w:val="left" w:pos="1500"/>
+        </w:tabs>
+        <w:spacing w:after="70" w:line="300"/>
+        <w:ind w:left="1000" w:hanging="600"/>
+      </w:pPr>
+      <w:r>
+        <w:rPr>
+          <w:rFonts w:ascii="Times New Roman" w:cs="Times New Roman" w:eastAsia="Times New Roman" w:hAnsi="Times New Roman"/>
+          <w:sz w:val="24"/>
+          <w:szCs w:val="24"/>
+        </w:rPr>
+        <w:t xml:space="preserve">(b)	With the aid of a sketch map, describe the main characteristics of the Western Highlands. </w:t>
+      </w:r>
+      <w:r>
+        <w:rPr>
+          <w:rFonts w:ascii="Times New Roman" w:cs="Times New Roman" w:eastAsia="Times New Roman" w:hAnsi="Times New Roman"/>
+          <w:b/>
+          <w:bCs/>
+          <w:sz w:val="24"/>
+          <w:szCs w:val="24"/>
+        </w:rPr>
+        <w:t xml:space="preserve">(7 marks)</w:t>
+      </w:r>
+    </w:p>
+    <w:p>
+      <w:pPr>
+        <w:tabs>
+          <w:tab w:val="left" w:pos="1000"/>
+          <w:tab w:val="left" w:pos="1500"/>
+        </w:tabs>
+        <w:spacing w:after="70" w:line="300"/>
+        <w:ind w:left="1000" w:hanging="600"/>
+      </w:pPr>
+      <w:r>
+        <w:rPr>
+          <w:rFonts w:ascii="Times New Roman" w:cs="Times New Roman" w:eastAsia="Times New Roman" w:hAnsi="Times New Roman"/>
+          <w:sz w:val="24"/>
+          <w:szCs w:val="24"/>
+        </w:rPr>
+        <w:t xml:space="preserve">(c)	Explain how the air masses and the movement of the ITCZ produce the seasons of Cameroon. </w:t>
+      </w:r>
+      <w:r>
+        <w:rPr>
+          <w:rFonts w:ascii="Times New Roman" w:cs="Times New Roman" w:eastAsia="Times New Roman" w:hAnsi="Times New Roman"/>
+          <w:b/>
+          <w:bCs/>
+          <w:sz w:val="24"/>
+          <w:szCs w:val="24"/>
+        </w:rPr>
+        <w:t xml:space="preserve">(8 marks)</w:t>
       </w:r>
     </w:p>
     <w:p>

</xml_diff>

<commit_message>
LSA and USA first sequence: each section strictly its own sub-branch, Geography of Cameroon apart
USA: Mme Tsogo's questions split into Economic Geography (agriculture,
resources) and Environment and Development (pollution); Geography of
Cameroon moved to its own last section; Cameroon references removed from
the geomorphology, population and settlement questions. LSA: same removal
in the population and settlement questions.

Co-Authored-By: Claude Opus 5.5 <noreply@anthropic.com>
Claude-Session: https://claude.ai/code/session_0115LFSb2ktGLWPeVksFkSer
</commit_message>
<xml_diff>
--- a/epreuves/2026-2027/Sequence_1/LSA_Geography_Seq1_2026-2027.docx
+++ b/epreuves/2026-2027/Sequence_1/LSA_Geography_Seq1_2026-2027.docx
@@ -1462,7 +1462,7 @@
           <w:sz w:val="24"/>
           <w:szCs w:val="24"/>
         </w:rPr>
-        <w:t xml:space="preserve"> problems faced when conducting a population census in a developing country such as Cameroon. </w:t>
+        <w:t xml:space="preserve"> problems faced when conducting a population census in developing countries. </w:t>
       </w:r>
       <w:r>
         <w:rPr>
@@ -1490,7 +1490,7 @@
           <w:sz w:val="24"/>
           <w:szCs w:val="24"/>
         </w:rPr>
-        <w:t xml:space="preserve">(c)	(i)	Cameroon has about 29 million inhabitants on an area of 475,650 km². Calculate its arithmetic density. </w:t>
+        <w:t xml:space="preserve">(c)	(i)	A country has 29 million inhabitants on an area of 475,650 km². Calculate its arithmetic density. </w:t>
       </w:r>
       <w:r>
         <w:rPr>
@@ -1652,7 +1652,7 @@
           <w:sz w:val="24"/>
           <w:szCs w:val="24"/>
         </w:rPr>
-        <w:t xml:space="preserve">(c)	With reference to a named town in Cameroon, show how its situation has favoured its growth. </w:t>
+        <w:t xml:space="preserve">(c)	With reference to a named town, show how its situation has favoured its growth. </w:t>
       </w:r>
       <w:r>
         <w:rPr>

</xml_diff>